<commit_message>
Java Documentation Comments (Javadoc) and Best Practices  #46
</commit_message>
<xml_diff>
--- a/Chapter4/Chapter4_2.docx
+++ b/Chapter4/Chapter4_2.docx
@@ -207,41 +207,7 @@
     </w:p>
     <w:p>
       <w:r>
-        <w:t xml:space="preserve">Instead of writing constructors, getters, </w:t>
-      </w:r>
-      <w:proofErr w:type="gramStart"/>
-      <w:r>
-        <w:t>equals(</w:t>
-      </w:r>
-      <w:proofErr w:type="gramEnd"/>
-      <w:r>
-        <w:t xml:space="preserve">), </w:t>
-      </w:r>
-      <w:proofErr w:type="spellStart"/>
-      <w:proofErr w:type="gramStart"/>
-      <w:r>
-        <w:t>hashCode</w:t>
-      </w:r>
-      <w:proofErr w:type="spellEnd"/>
-      <w:r>
-        <w:t>(</w:t>
-      </w:r>
-      <w:proofErr w:type="gramEnd"/>
-      <w:r>
-        <w:t xml:space="preserve">), and </w:t>
-      </w:r>
-      <w:proofErr w:type="spellStart"/>
-      <w:proofErr w:type="gramStart"/>
-      <w:r>
-        <w:t>toString</w:t>
-      </w:r>
-      <w:proofErr w:type="spellEnd"/>
-      <w:r>
-        <w:t>(</w:t>
-      </w:r>
-      <w:proofErr w:type="gramEnd"/>
-      <w:r>
-        <w:t>) manually, Java generates them automatically.</w:t>
+        <w:t>Instead of writing constructors, getters, equals(), hashCode(), and toString() manually, Java generates them automatically.</w:t>
       </w:r>
     </w:p>
     <w:p/>
@@ -282,41 +248,7 @@
         <w:t>y</w:t>
       </w:r>
       <w:r>
-        <w:t xml:space="preserve"> coordinates. However, a normal class requires defining private fields, a constructor, getter methods, and overriding methods such as </w:t>
-      </w:r>
-      <w:proofErr w:type="spellStart"/>
-      <w:proofErr w:type="gramStart"/>
-      <w:r>
-        <w:t>toString</w:t>
-      </w:r>
-      <w:proofErr w:type="spellEnd"/>
-      <w:r>
-        <w:t>(</w:t>
-      </w:r>
-      <w:proofErr w:type="gramEnd"/>
-      <w:r>
-        <w:t xml:space="preserve">), </w:t>
-      </w:r>
-      <w:proofErr w:type="gramStart"/>
-      <w:r>
-        <w:t>equals(</w:t>
-      </w:r>
-      <w:proofErr w:type="gramEnd"/>
-      <w:r>
-        <w:t xml:space="preserve">), and </w:t>
-      </w:r>
-      <w:proofErr w:type="spellStart"/>
-      <w:proofErr w:type="gramStart"/>
-      <w:r>
-        <w:t>hashCode</w:t>
-      </w:r>
-      <w:proofErr w:type="spellEnd"/>
-      <w:r>
-        <w:t>(</w:t>
-      </w:r>
-      <w:proofErr w:type="gramEnd"/>
-      <w:r>
-        <w:t>).</w:t>
+        <w:t xml:space="preserve"> coordinates. However, a normal class requires defining private fields, a constructor, getter methods, and overriding methods such as toString(), equals(), and hashCode().</w:t>
       </w:r>
     </w:p>
     <w:p>
@@ -341,15 +273,7 @@
     </w:p>
     <w:p>
       <w:r>
-        <w:t xml:space="preserve">Since a point does not contain complex </w:t>
-      </w:r>
-      <w:proofErr w:type="spellStart"/>
-      <w:r>
-        <w:t>behavior</w:t>
-      </w:r>
-      <w:proofErr w:type="spellEnd"/>
-      <w:r>
-        <w:t xml:space="preserve"> and is simply a container for immutable data, creating a full class can be unnecessary. Java </w:t>
+        <w:t xml:space="preserve">Since a point does not contain complex behavior and is simply a container for immutable data, creating a full class can be unnecessary. Java </w:t>
       </w:r>
       <w:r>
         <w:rPr>
@@ -374,23 +298,7 @@
           <w:b/>
           <w:bCs/>
         </w:rPr>
-        <w:t xml:space="preserve">record </w:t>
-      </w:r>
-      <w:proofErr w:type="gramStart"/>
-      <w:r>
-        <w:rPr>
-          <w:b/>
-          <w:bCs/>
-        </w:rPr>
-        <w:t>Point(</w:t>
-      </w:r>
-      <w:proofErr w:type="gramEnd"/>
-      <w:r>
-        <w:rPr>
-          <w:b/>
-          <w:bCs/>
-        </w:rPr>
-        <w:t>double x, double y) {}</w:t>
+        <w:t>record Point(double x, double y) {}</w:t>
       </w:r>
     </w:p>
     <w:p>
@@ -444,13 +352,8 @@
           <w:numId w:val="2"/>
         </w:numPr>
       </w:pPr>
-      <w:proofErr w:type="gramStart"/>
-      <w:r>
-        <w:t>equals(</w:t>
-      </w:r>
-      <w:proofErr w:type="gramEnd"/>
-      <w:r>
-        <w:t xml:space="preserve">) </w:t>
+      <w:r>
+        <w:t xml:space="preserve">equals() </w:t>
       </w:r>
     </w:p>
     <w:p>
@@ -460,18 +363,8 @@
           <w:numId w:val="2"/>
         </w:numPr>
       </w:pPr>
-      <w:proofErr w:type="spellStart"/>
-      <w:proofErr w:type="gramStart"/>
-      <w:r>
-        <w:t>hashCode</w:t>
-      </w:r>
-      <w:proofErr w:type="spellEnd"/>
-      <w:r>
-        <w:t>(</w:t>
-      </w:r>
-      <w:proofErr w:type="gramEnd"/>
-      <w:r>
-        <w:t xml:space="preserve">) </w:t>
+      <w:r>
+        <w:t xml:space="preserve">hashCode() </w:t>
       </w:r>
     </w:p>
     <w:p>
@@ -481,18 +374,8 @@
           <w:numId w:val="2"/>
         </w:numPr>
       </w:pPr>
-      <w:proofErr w:type="spellStart"/>
-      <w:proofErr w:type="gramStart"/>
-      <w:r>
-        <w:t>toString</w:t>
-      </w:r>
-      <w:proofErr w:type="spellEnd"/>
-      <w:r>
-        <w:t>(</w:t>
-      </w:r>
-      <w:proofErr w:type="gramEnd"/>
-      <w:r>
-        <w:t>)</w:t>
+      <w:r>
+        <w:t>toString()</w:t>
       </w:r>
     </w:p>
     <w:p>
@@ -614,18 +497,8 @@
           <w:numId w:val="4"/>
         </w:numPr>
       </w:pPr>
-      <w:proofErr w:type="spellStart"/>
-      <w:proofErr w:type="gramStart"/>
-      <w:r>
-        <w:t>toString</w:t>
-      </w:r>
-      <w:proofErr w:type="spellEnd"/>
-      <w:r>
-        <w:t>(</w:t>
-      </w:r>
-      <w:proofErr w:type="gramEnd"/>
-      <w:r>
-        <w:t xml:space="preserve">) </w:t>
+      <w:r>
+        <w:t xml:space="preserve">toString() </w:t>
       </w:r>
     </w:p>
     <w:p>
@@ -635,13 +508,8 @@
           <w:numId w:val="4"/>
         </w:numPr>
       </w:pPr>
-      <w:proofErr w:type="gramStart"/>
-      <w:r>
-        <w:t>equals(</w:t>
-      </w:r>
-      <w:proofErr w:type="gramEnd"/>
-      <w:r>
-        <w:t xml:space="preserve">) </w:t>
+      <w:r>
+        <w:t xml:space="preserve">equals() </w:t>
       </w:r>
     </w:p>
     <w:p>
@@ -651,18 +519,8 @@
           <w:numId w:val="4"/>
         </w:numPr>
       </w:pPr>
-      <w:proofErr w:type="spellStart"/>
-      <w:proofErr w:type="gramStart"/>
-      <w:r>
-        <w:t>hashCode</w:t>
-      </w:r>
-      <w:proofErr w:type="spellEnd"/>
-      <w:r>
-        <w:t>(</w:t>
-      </w:r>
-      <w:proofErr w:type="gramEnd"/>
-      <w:r>
-        <w:t>)</w:t>
+      <w:r>
+        <w:t>hashCode()</w:t>
       </w:r>
     </w:p>
     <w:p>
@@ -682,15 +540,7 @@
     </w:p>
     <w:p>
       <w:r>
-        <w:t xml:space="preserve">Although records are mainly used for storing data, they can also contain custom methods. This allows developers to add related </w:t>
-      </w:r>
-      <w:proofErr w:type="spellStart"/>
-      <w:r>
-        <w:t>behavior</w:t>
-      </w:r>
-      <w:proofErr w:type="spellEnd"/>
-      <w:r>
-        <w:t xml:space="preserve"> without losing the simplicity of the record structure.</w:t>
+        <w:t>Although records are mainly used for storing data, they can also contain custom methods. This allows developers to add related behavior without losing the simplicity of the record structure.</w:t>
       </w:r>
     </w:p>
     <w:p>
@@ -894,41 +744,7 @@
         <w:t>Data Transfer Objects (DTOs)</w:t>
       </w:r>
       <w:r>
-        <w:t xml:space="preserve"> in REST APIs, microservices communication, database projections, and configuration objects. For example, an API response or request object can be represented as a record, making the code cleaner while automatically providing constructors, accessors, </w:t>
-      </w:r>
-      <w:proofErr w:type="gramStart"/>
-      <w:r>
-        <w:t>equals(</w:t>
-      </w:r>
-      <w:proofErr w:type="gramEnd"/>
-      <w:r>
-        <w:t xml:space="preserve">), </w:t>
-      </w:r>
-      <w:proofErr w:type="spellStart"/>
-      <w:proofErr w:type="gramStart"/>
-      <w:r>
-        <w:t>hashCode</w:t>
-      </w:r>
-      <w:proofErr w:type="spellEnd"/>
-      <w:r>
-        <w:t>(</w:t>
-      </w:r>
-      <w:proofErr w:type="gramEnd"/>
-      <w:r>
-        <w:t xml:space="preserve">), and </w:t>
-      </w:r>
-      <w:proofErr w:type="spellStart"/>
-      <w:proofErr w:type="gramStart"/>
-      <w:r>
-        <w:t>toString</w:t>
-      </w:r>
-      <w:proofErr w:type="spellEnd"/>
-      <w:r>
-        <w:t>(</w:t>
-      </w:r>
-      <w:proofErr w:type="gramEnd"/>
-      <w:r>
-        <w:t xml:space="preserve">) methods. Records are especially useful in modern enterprise applications because they make data exchange between system layers safer, easier to maintain, and more readable. </w:t>
+        <w:t xml:space="preserve"> in REST APIs, microservices communication, database projections, and configuration objects. For example, an API response or request object can be represented as a record, making the code cleaner while automatically providing constructors, accessors, equals(), hashCode(), and toString() methods. Records are especially useful in modern enterprise applications because they make data exchange between system layers safer, easier to maintain, and more readable. </w:t>
       </w:r>
     </w:p>
     <w:p>
@@ -948,53 +764,201 @@
           <w:b/>
           <w:bCs/>
         </w:rPr>
-        <w:t xml:space="preserve">public record </w:t>
-      </w:r>
-      <w:proofErr w:type="spellStart"/>
-      <w:proofErr w:type="gramStart"/>
-      <w:r>
-        <w:rPr>
-          <w:b/>
-          <w:bCs/>
-        </w:rPr>
-        <w:t>UserResponse</w:t>
-      </w:r>
-      <w:proofErr w:type="spellEnd"/>
-      <w:r>
-        <w:rPr>
-          <w:b/>
-          <w:bCs/>
-        </w:rPr>
-        <w:t>( Long</w:t>
-      </w:r>
-      <w:proofErr w:type="gramEnd"/>
-      <w:r>
-        <w:rPr>
-          <w:b/>
-          <w:bCs/>
-        </w:rPr>
-        <w:t xml:space="preserve"> id, String name, String </w:t>
-      </w:r>
-      <w:proofErr w:type="gramStart"/>
-      <w:r>
-        <w:rPr>
-          <w:b/>
-          <w:bCs/>
-        </w:rPr>
-        <w:t>email )</w:t>
-      </w:r>
-      <w:proofErr w:type="gramEnd"/>
-      <w:r>
-        <w:rPr>
-          <w:b/>
-          <w:bCs/>
-        </w:rPr>
-        <w:t xml:space="preserve"> {}</w:t>
+        <w:t>public record UserResponse( Long id, String name, String email ) {}</w:t>
       </w:r>
     </w:p>
     <w:p>
       <w:r>
         <w:t>his record can be used as an API response object between the backend service and frontend application without needing a traditional Java class with many lines of boilerplate code.</w:t>
+      </w:r>
+    </w:p>
+    <w:p/>
+    <w:p>
+      <w:pPr>
+        <w:rPr>
+          <w:b/>
+          <w:bCs/>
+        </w:rPr>
+      </w:pPr>
+      <w:r>
+        <w:rPr>
+          <w:b/>
+          <w:bCs/>
+        </w:rPr>
+        <w:t>4.8 Packages</w:t>
+      </w:r>
+    </w:p>
+    <w:p>
+      <w:r>
+        <w:t xml:space="preserve">A </w:t>
+      </w:r>
+      <w:r>
+        <w:rPr>
+          <w:b/>
+          <w:bCs/>
+        </w:rPr>
+        <w:t>package</w:t>
+      </w:r>
+      <w:r>
+        <w:t xml:space="preserve"> in Java is a mechanism used to group related classes, interfaces, and sub-packages into a single namespace. Packages help organize large applications, avoid class name conflicts, and provide better code structure and access control.</w:t>
+      </w:r>
+    </w:p>
+    <w:p>
+      <w:r>
+        <w:t>For example, instead of keeping hundreds of classes in one place, a large application can organize them like:</w:t>
+      </w:r>
+    </w:p>
+    <w:p>
+      <w:pPr>
+        <w:rPr>
+          <w:b/>
+          <w:bCs/>
+        </w:rPr>
+      </w:pPr>
+      <w:r>
+        <w:rPr>
+          <w:b/>
+          <w:bCs/>
+        </w:rPr>
+        <w:t xml:space="preserve">com.company.employee </w:t>
+      </w:r>
+    </w:p>
+    <w:p>
+      <w:pPr>
+        <w:rPr>
+          <w:b/>
+          <w:bCs/>
+        </w:rPr>
+      </w:pPr>
+      <w:r>
+        <w:rPr>
+          <w:b/>
+          <w:bCs/>
+        </w:rPr>
+        <w:t xml:space="preserve">com.company.payment </w:t>
+      </w:r>
+    </w:p>
+    <w:p>
+      <w:pPr>
+        <w:rPr>
+          <w:b/>
+          <w:bCs/>
+        </w:rPr>
+      </w:pPr>
+      <w:r>
+        <w:rPr>
+          <w:b/>
+          <w:bCs/>
+        </w:rPr>
+        <w:t>com.company.security</w:t>
+      </w:r>
+    </w:p>
+    <w:p>
+      <w:r>
+        <w:t>Each package contains classes related to a specific responsibility.</w:t>
+      </w:r>
+    </w:p>
+    <w:p>
+      <w:pPr>
+        <w:rPr>
+          <w:b/>
+          <w:bCs/>
+        </w:rPr>
+      </w:pPr>
+      <w:r>
+        <w:rPr>
+          <w:b/>
+          <w:bCs/>
+        </w:rPr>
+        <w:t>Why Do We Use Packages?</w:t>
+      </w:r>
+    </w:p>
+    <w:p>
+      <w:r>
+        <w:t xml:space="preserve">The main purpose of packages is to avoid </w:t>
+      </w:r>
+      <w:r>
+        <w:rPr>
+          <w:b/>
+          <w:bCs/>
+        </w:rPr>
+        <w:t>class name conflicts</w:t>
+      </w:r>
+      <w:r>
+        <w:t>.</w:t>
+      </w:r>
+      <w:r>
+        <w:t xml:space="preserve"> </w:t>
+      </w:r>
+      <w:r>
+        <w:t>Imagine two developers create a class called:</w:t>
+      </w:r>
+    </w:p>
+    <w:p>
+      <w:r>
+        <w:t>Without packages, Java cannot distinguish between them.</w:t>
+      </w:r>
+    </w:p>
+    <w:p>
+      <w:pPr>
+        <w:rPr>
+          <w:b/>
+          <w:bCs/>
+        </w:rPr>
+      </w:pPr>
+      <w:r>
+        <w:rPr>
+          <w:b/>
+          <w:bCs/>
+        </w:rPr>
+        <w:t>Package Naming Convention</w:t>
+      </w:r>
+    </w:p>
+    <w:p>
+      <w:r>
+        <w:t>Java developers usually use the reverse domain name convention to create unique package names.</w:t>
+      </w:r>
+    </w:p>
+    <w:p>
+      <w:pPr>
+        <w:rPr>
+          <w:b/>
+          <w:bCs/>
+        </w:rPr>
+      </w:pPr>
+      <w:r>
+        <w:rPr>
+          <w:b/>
+          <w:bCs/>
+        </w:rPr>
+        <w:t>Using Classes from Other Packages</w:t>
+      </w:r>
+    </w:p>
+    <w:p>
+      <w:r>
+        <w:t>A class can access public classes from another package in two ways:</w:t>
+      </w:r>
+    </w:p>
+    <w:p>
+      <w:pPr>
+        <w:numPr>
+          <w:ilvl w:val="0"/>
+          <w:numId w:val="6"/>
+        </w:numPr>
+      </w:pPr>
+      <w:r>
+        <w:t xml:space="preserve">Using the full package name </w:t>
+      </w:r>
+    </w:p>
+    <w:p>
+      <w:pPr>
+        <w:numPr>
+          <w:ilvl w:val="0"/>
+          <w:numId w:val="6"/>
+        </w:numPr>
+      </w:pPr>
+      <w:r>
+        <w:t>Using an import statement</w:t>
       </w:r>
     </w:p>
     <w:p/>
@@ -1011,7 +975,23 @@
           <w:b/>
           <w:bCs/>
         </w:rPr>
-        <w:t>4.8 Packages</w:t>
+        <w:lastRenderedPageBreak/>
+        <w:t>Packages vs Modules</w:t>
+      </w:r>
+    </w:p>
+    <w:p>
+      <w:r>
+        <w:t>Packages organize classes inside an application.</w:t>
+      </w:r>
+    </w:p>
+    <w:p>
+      <w:r>
+        <w:t>Modules (introduced in Java 9) organize groups of packages and provide stronger encapsulation.</w:t>
+      </w:r>
+    </w:p>
+    <w:p>
+      <w:r>
+        <w:t>Java packages are a fundamental feature for organizing classes and building scalable applications. They provide a way to group related code, prevent naming conflicts, control access, and improve project structure. In real-world systems, packages are used to separate layers such as controllers, services, repositories, and models, making applications easier to develop, test, and maintain.</w:t>
       </w:r>
     </w:p>
     <w:p>
@@ -1030,6 +1010,103 @@
       </w:r>
     </w:p>
     <w:p>
+      <w:r>
+        <w:t>A JAR (Java Archive) file is a package format used to combine multiple Java files, resources, and metadata into a single compressed file. JAR files are commonly used to distribute Java applications and libraries because they simplify deployment and reduce the number of files that need to be shared. A JAR file can contain .class files, images, configuration files, and a manifest file that provides information about the archive. In real systems, third-party libraries such as frameworks and APIs are usually distributed as JAR files that developers add to their projects.</w:t>
+      </w:r>
+    </w:p>
+    <w:p>
+      <w:pPr>
+        <w:rPr>
+          <w:b/>
+          <w:bCs/>
+        </w:rPr>
+      </w:pPr>
+      <w:r>
+        <w:rPr>
+          <w:b/>
+          <w:bCs/>
+        </w:rPr>
+        <w:t>Creating a JAR File</w:t>
+      </w:r>
+    </w:p>
+    <w:p>
+      <w:r>
+        <w:t>The Java Development Kit provides the jar command to create archives.</w:t>
+      </w:r>
+    </w:p>
+    <w:p>
+      <w:r>
+        <w:t>jar cvf EmployeeApp.jar *.class</w:t>
+      </w:r>
+    </w:p>
+    <w:p>
+      <w:pPr>
+        <w:rPr>
+          <w:b/>
+          <w:bCs/>
+        </w:rPr>
+      </w:pPr>
+      <w:r>
+        <w:rPr>
+          <w:b/>
+          <w:bCs/>
+        </w:rPr>
+        <w:t>JAR File Structure</w:t>
+      </w:r>
+    </w:p>
+    <w:p>
+      <w:r>
+        <w:t>A typical JAR file looks like:</w:t>
+      </w:r>
+    </w:p>
+    <w:p>
+      <w:r>
+        <w:rPr>
+          <w:noProof/>
+        </w:rPr>
+        <w:drawing>
+          <wp:inline distT="0" distB="0" distL="0" distR="0" wp14:anchorId="13CC9B5C" wp14:editId="2B70CDC6">
+            <wp:extent cx="3276600" cy="1504950"/>
+            <wp:effectExtent l="0" t="0" r="0" b="0"/>
+            <wp:docPr id="1464791682" name="Picture 1"/>
+            <wp:cNvGraphicFramePr>
+              <a:graphicFrameLocks xmlns:a="http://schemas.openxmlformats.org/drawingml/2006/main" noChangeAspect="1"/>
+            </wp:cNvGraphicFramePr>
+            <a:graphic xmlns:a="http://schemas.openxmlformats.org/drawingml/2006/main">
+              <a:graphicData uri="http://schemas.openxmlformats.org/drawingml/2006/picture">
+                <pic:pic xmlns:pic="http://schemas.openxmlformats.org/drawingml/2006/picture">
+                  <pic:nvPicPr>
+                    <pic:cNvPr id="1464791682" name=""/>
+                    <pic:cNvPicPr/>
+                  </pic:nvPicPr>
+                  <pic:blipFill>
+                    <a:blip r:embed="rId5"/>
+                    <a:stretch>
+                      <a:fillRect/>
+                    </a:stretch>
+                  </pic:blipFill>
+                  <pic:spPr>
+                    <a:xfrm>
+                      <a:off x="0" y="0"/>
+                      <a:ext cx="3276600" cy="1504950"/>
+                    </a:xfrm>
+                    <a:prstGeom prst="rect">
+                      <a:avLst/>
+                    </a:prstGeom>
+                  </pic:spPr>
+                </pic:pic>
+              </a:graphicData>
+            </a:graphic>
+          </wp:inline>
+        </w:drawing>
+      </w:r>
+    </w:p>
+    <w:p>
+      <w:r>
+        <w:t>A JAR file can work like a normal application if it contains a main class.</w:t>
+      </w:r>
+    </w:p>
+    <w:p>
       <w:pPr>
         <w:rPr>
           <w:b/>
@@ -1045,6 +1122,33 @@
       </w:r>
     </w:p>
     <w:p>
+      <w:r>
+        <w:t>Documentation comments in Java are special comments written using /** ... */ syntax and are used to describe classes, methods, constructors, and fields. These comments are processed by the Javadoc tool to automatically generate HTML documentation for Java APIs. Good documentation comments explain what a class or method does, its parameters, return values, and possible exceptions, making code easier for other developers to understand and maintain.</w:t>
+      </w:r>
+    </w:p>
+    <w:p>
+      <w:r>
+        <w:t>Javadoc supports tags that provide structured information about code elements.</w:t>
+      </w:r>
+    </w:p>
+    <w:p>
+      <w:r>
+        <w:t>@author</w:t>
+      </w:r>
+      <w:r>
+        <w:t xml:space="preserve">  </w:t>
+      </w:r>
+      <w:r>
+        <w:t>Developer name</w:t>
+      </w:r>
+      <w:r>
+        <w:t xml:space="preserve">  </w:t>
+      </w:r>
+      <w:r>
+        <w:t>@author Ahmed</w:t>
+      </w:r>
+    </w:p>
+    <w:p>
       <w:pPr>
         <w:rPr>
           <w:b/>
@@ -1059,7 +1163,11 @@
         <w:t>4.11 Class Design Hints</w:t>
       </w:r>
     </w:p>
-    <w:p/>
+    <w:p>
+      <w:r>
+        <w:t>Good class design is essential for creating maintainable and scalable Java applications. A well-designed class should have a clear responsibility, hide internal implementation details using encapsulation, and expose only the necessary operations through public methods. Developers should keep classes focused on one purpose, use meaningful names, prefer private fields with controlled access, avoid unnecessary dependencies, and design classes that are easy to test and extend. Following good class design principles leads to cleaner code, better reuse, and easier maintenance in large software systems.</w:t>
+      </w:r>
+    </w:p>
     <w:sectPr>
       <w:pgSz w:w="11906" w:h="16838"/>
       <w:pgMar w:top="426" w:right="566" w:bottom="567" w:left="567" w:header="708" w:footer="708" w:gutter="0"/>
@@ -1633,6 +1741,119 @@
     </w:lvl>
   </w:abstractNum>
   <w:abstractNum w:abstractNumId="4" w15:restartNumberingAfterBreak="0">
+    <w:nsid w:val="2D752479"/>
+    <w:multiLevelType w:val="multilevel"/>
+    <w:tmpl w:val="DD8E2C82"/>
+    <w:lvl w:ilvl="0">
+      <w:start w:val="1"/>
+      <w:numFmt w:val="decimal"/>
+      <w:lvlText w:val="%1."/>
+      <w:lvlJc w:val="left"/>
+      <w:pPr>
+        <w:tabs>
+          <w:tab w:val="num" w:pos="720"/>
+        </w:tabs>
+        <w:ind w:left="720" w:hanging="360"/>
+      </w:pPr>
+    </w:lvl>
+    <w:lvl w:ilvl="1" w:tentative="1">
+      <w:start w:val="1"/>
+      <w:numFmt w:val="decimal"/>
+      <w:lvlText w:val="%2."/>
+      <w:lvlJc w:val="left"/>
+      <w:pPr>
+        <w:tabs>
+          <w:tab w:val="num" w:pos="1440"/>
+        </w:tabs>
+        <w:ind w:left="1440" w:hanging="360"/>
+      </w:pPr>
+    </w:lvl>
+    <w:lvl w:ilvl="2" w:tentative="1">
+      <w:start w:val="1"/>
+      <w:numFmt w:val="decimal"/>
+      <w:lvlText w:val="%3."/>
+      <w:lvlJc w:val="left"/>
+      <w:pPr>
+        <w:tabs>
+          <w:tab w:val="num" w:pos="2160"/>
+        </w:tabs>
+        <w:ind w:left="2160" w:hanging="360"/>
+      </w:pPr>
+    </w:lvl>
+    <w:lvl w:ilvl="3" w:tentative="1">
+      <w:start w:val="1"/>
+      <w:numFmt w:val="decimal"/>
+      <w:lvlText w:val="%4."/>
+      <w:lvlJc w:val="left"/>
+      <w:pPr>
+        <w:tabs>
+          <w:tab w:val="num" w:pos="2880"/>
+        </w:tabs>
+        <w:ind w:left="2880" w:hanging="360"/>
+      </w:pPr>
+    </w:lvl>
+    <w:lvl w:ilvl="4" w:tentative="1">
+      <w:start w:val="1"/>
+      <w:numFmt w:val="decimal"/>
+      <w:lvlText w:val="%5."/>
+      <w:lvlJc w:val="left"/>
+      <w:pPr>
+        <w:tabs>
+          <w:tab w:val="num" w:pos="3600"/>
+        </w:tabs>
+        <w:ind w:left="3600" w:hanging="360"/>
+      </w:pPr>
+    </w:lvl>
+    <w:lvl w:ilvl="5" w:tentative="1">
+      <w:start w:val="1"/>
+      <w:numFmt w:val="decimal"/>
+      <w:lvlText w:val="%6."/>
+      <w:lvlJc w:val="left"/>
+      <w:pPr>
+        <w:tabs>
+          <w:tab w:val="num" w:pos="4320"/>
+        </w:tabs>
+        <w:ind w:left="4320" w:hanging="360"/>
+      </w:pPr>
+    </w:lvl>
+    <w:lvl w:ilvl="6" w:tentative="1">
+      <w:start w:val="1"/>
+      <w:numFmt w:val="decimal"/>
+      <w:lvlText w:val="%7."/>
+      <w:lvlJc w:val="left"/>
+      <w:pPr>
+        <w:tabs>
+          <w:tab w:val="num" w:pos="5040"/>
+        </w:tabs>
+        <w:ind w:left="5040" w:hanging="360"/>
+      </w:pPr>
+    </w:lvl>
+    <w:lvl w:ilvl="7" w:tentative="1">
+      <w:start w:val="1"/>
+      <w:numFmt w:val="decimal"/>
+      <w:lvlText w:val="%8."/>
+      <w:lvlJc w:val="left"/>
+      <w:pPr>
+        <w:tabs>
+          <w:tab w:val="num" w:pos="5760"/>
+        </w:tabs>
+        <w:ind w:left="5760" w:hanging="360"/>
+      </w:pPr>
+    </w:lvl>
+    <w:lvl w:ilvl="8" w:tentative="1">
+      <w:start w:val="1"/>
+      <w:numFmt w:val="decimal"/>
+      <w:lvlText w:val="%9."/>
+      <w:lvlJc w:val="left"/>
+      <w:pPr>
+        <w:tabs>
+          <w:tab w:val="num" w:pos="6480"/>
+        </w:tabs>
+        <w:ind w:left="6480" w:hanging="360"/>
+      </w:pPr>
+    </w:lvl>
+  </w:abstractNum>
+  <w:abstractNum w:abstractNumId="5" w15:restartNumberingAfterBreak="0">
     <w:nsid w:val="52F00743"/>
     <w:multiLevelType w:val="multilevel"/>
     <w:tmpl w:val="923C8204"/>
@@ -1782,7 +2003,7 @@
     </w:lvl>
   </w:abstractNum>
   <w:num w:numId="1" w16cid:durableId="501745207">
-    <w:abstractNumId w:val="4"/>
+    <w:abstractNumId w:val="5"/>
   </w:num>
   <w:num w:numId="2" w16cid:durableId="669258061">
     <w:abstractNumId w:val="1"/>
@@ -1795,6 +2016,9 @@
   </w:num>
   <w:num w:numId="5" w16cid:durableId="1090128648">
     <w:abstractNumId w:val="2"/>
+  </w:num>
+  <w:num w:numId="6" w16cid:durableId="38210605">
+    <w:abstractNumId w:val="4"/>
   </w:num>
 </w:numbering>
 </file>

</xml_diff>